<commit_message>
Add AWS Solutions Architect – Associate to resume
</commit_message>
<xml_diff>
--- a/Manideep_Grandhi_Resume.docx
+++ b/Manideep_Grandhi_Resume.docx
@@ -1860,6 +1860,27 @@
         </w:rPr>
         <w:lastRenderedPageBreak/>
         <w:t>Certifications</w:t>
+      </w:r>
+    </w:p>
+    <w:p>
+      <w:pPr>
+        <w:spacing w:before="100" w:beforeAutospacing="1" w:after="100" w:afterAutospacing="1" w:line="240" w:lineRule="auto"/>
+        <w:outlineLvl w:val="2"/>
+        <w:rPr>
+          <w:rFonts w:eastAsia="Times New Roman" w:cstheme="minorHAnsi"/>
+          <w:sz w:val="24"/>
+          <w:szCs w:val="24"/>
+          <w:lang w:eastAsia="en-IN"/>
+        </w:rPr>
+      </w:pPr>
+      <w:r>
+        <w:rPr>
+          <w:rFonts w:eastAsia="Times New Roman" w:cstheme="minorHAnsi"/>
+          <w:sz w:val="24"/>
+          <w:szCs w:val="24"/>
+          <w:lang w:eastAsia="en-IN"/>
+        </w:rPr>
+        <w:t>AWS Certified Solutions Architect – Associate (Amazon Web Services)</w:t>
       </w:r>
     </w:p>
     <w:p>

</xml_diff>